<commit_message>
Refactor currency API URL in CurrencyContext.jsx
</commit_message>
<xml_diff>
--- a/Report/Task_05_Report.docx
+++ b/Report/Task_05_Report.docx
@@ -237,6 +237,7 @@
           <w:rFonts w:ascii="Times New Roman" w:hAnsi="Times New Roman" w:cs="Times New Roman"/>
           <w:b/>
           <w:bCs/>
+          <w:noProof/>
           <w:sz w:val="32"/>
           <w:szCs w:val="32"/>
         </w:rPr>
@@ -388,6 +389,102 @@
         </w:rPr>
         <w:t>-API) to fetch current currency rates.</w:t>
       </w:r>
+      <w:r>
+        <w:rPr>
+          <w:rFonts w:ascii="Times New Roman" w:hAnsi="Times New Roman" w:cs="Times New Roman"/>
+          <w:sz w:val="28"/>
+          <w:szCs w:val="28"/>
+        </w:rPr>
+        <w:t xml:space="preserve"> For Real time </w:t>
+      </w:r>
+      <w:r>
+        <w:rPr>
+          <w:rFonts w:ascii="Times New Roman" w:hAnsi="Times New Roman" w:cs="Times New Roman"/>
+          <w:sz w:val="28"/>
+          <w:szCs w:val="28"/>
+        </w:rPr>
+        <w:t>Currency</w:t>
+      </w:r>
+      <w:r>
+        <w:rPr>
+          <w:rFonts w:ascii="Times New Roman" w:hAnsi="Times New Roman" w:cs="Times New Roman"/>
+          <w:sz w:val="28"/>
+          <w:szCs w:val="28"/>
+        </w:rPr>
+        <w:t xml:space="preserve"> exchange rate, I h</w:t>
+      </w:r>
+      <w:r>
+        <w:rPr>
+          <w:rFonts w:ascii="Times New Roman" w:hAnsi="Times New Roman" w:cs="Times New Roman"/>
+          <w:sz w:val="28"/>
+          <w:szCs w:val="28"/>
+        </w:rPr>
+        <w:t>av</w:t>
+      </w:r>
+      <w:r>
+        <w:rPr>
+          <w:rFonts w:ascii="Times New Roman" w:hAnsi="Times New Roman" w:cs="Times New Roman"/>
+          <w:sz w:val="28"/>
+          <w:szCs w:val="28"/>
+        </w:rPr>
+        <w:t xml:space="preserve">e used this </w:t>
+      </w:r>
+      <w:proofErr w:type="spellStart"/>
+      <w:r>
+        <w:rPr>
+          <w:rFonts w:ascii="Times New Roman" w:hAnsi="Times New Roman" w:cs="Times New Roman"/>
+          <w:sz w:val="28"/>
+          <w:szCs w:val="28"/>
+        </w:rPr>
+        <w:t>api</w:t>
+      </w:r>
+      <w:proofErr w:type="spellEnd"/>
+      <w:r>
+        <w:rPr>
+          <w:rFonts w:ascii="Times New Roman" w:hAnsi="Times New Roman" w:cs="Times New Roman"/>
+          <w:sz w:val="28"/>
+          <w:szCs w:val="28"/>
+        </w:rPr>
+        <w:t xml:space="preserve"> -</w:t>
+      </w:r>
+      <w:hyperlink r:id="rId7" w:history="1">
+        <w:r>
+          <w:rPr>
+            <w:rStyle w:val="Hyperlink"/>
+            <w:rFonts w:ascii="Times New Roman" w:hAnsi="Times New Roman" w:cs="Times New Roman"/>
+            <w:sz w:val="28"/>
+            <w:szCs w:val="28"/>
+          </w:rPr>
+          <w:t xml:space="preserve"> </w:t>
+        </w:r>
+        <w:r>
+          <w:rPr>
+            <w:rStyle w:val="Hyperlink"/>
+            <w:rFonts w:ascii="Times New Roman" w:hAnsi="Times New Roman" w:cs="Times New Roman"/>
+            <w:sz w:val="28"/>
+            <w:szCs w:val="28"/>
+          </w:rPr>
+          <w:t>https://app</w:t>
+        </w:r>
+        <w:r>
+          <w:rPr>
+            <w:rStyle w:val="Hyperlink"/>
+            <w:rFonts w:ascii="Times New Roman" w:hAnsi="Times New Roman" w:cs="Times New Roman"/>
+            <w:sz w:val="28"/>
+            <w:szCs w:val="28"/>
+          </w:rPr>
+          <w:t>.</w:t>
+        </w:r>
+        <w:r>
+          <w:rPr>
+            <w:rStyle w:val="Hyperlink"/>
+            <w:rFonts w:ascii="Times New Roman" w:hAnsi="Times New Roman" w:cs="Times New Roman"/>
+            <w:sz w:val="28"/>
+            <w:szCs w:val="28"/>
+          </w:rPr>
+          <w:t>currencyapi.com</w:t>
+        </w:r>
+      </w:hyperlink>
     </w:p>
     <w:p>
       <w:pPr>
@@ -503,7 +600,11 @@
       </w:r>
     </w:p>
     <w:p/>
-    <w:p/>
+    <w:p>
+      <w:pPr>
+        <w:jc w:val="right"/>
+      </w:pPr>
+    </w:p>
     <w:sectPr>
       <w:pgSz w:w="11906" w:h="16838"/>
       <w:pgMar w:top="1440" w:right="1440" w:bottom="1440" w:left="1440" w:header="708" w:footer="708" w:gutter="0"/>
@@ -1308,6 +1409,7 @@
   <w:style w:type="character" w:default="1" w:styleId="DefaultParagraphFont">
     <w:name w:val="Default Paragraph Font"/>
     <w:uiPriority w:val="1"/>
+    <w:semiHidden/>
     <w:unhideWhenUsed/>
   </w:style>
   <w:style w:type="table" w:default="1" w:styleId="TableNormal">
@@ -1341,6 +1443,41 @@
       <w:ind w:left="720"/>
       <w:contextualSpacing/>
     </w:pPr>
+  </w:style>
+  <w:style w:type="character" w:styleId="Hyperlink">
+    <w:name w:val="Hyperlink"/>
+    <w:basedOn w:val="DefaultParagraphFont"/>
+    <w:uiPriority w:val="99"/>
+    <w:unhideWhenUsed/>
+    <w:rsid w:val="00607532"/>
+    <w:rPr>
+      <w:color w:val="0563C1" w:themeColor="hyperlink"/>
+      <w:u w:val="single"/>
+    </w:rPr>
+  </w:style>
+  <w:style w:type="character" w:styleId="UnresolvedMention">
+    <w:name w:val="Unresolved Mention"/>
+    <w:basedOn w:val="DefaultParagraphFont"/>
+    <w:uiPriority w:val="99"/>
+    <w:semiHidden/>
+    <w:unhideWhenUsed/>
+    <w:rsid w:val="00607532"/>
+    <w:rPr>
+      <w:color w:val="605E5C"/>
+      <w:shd w:val="clear" w:color="auto" w:fill="E1DFDD"/>
+    </w:rPr>
+  </w:style>
+  <w:style w:type="character" w:styleId="FollowedHyperlink">
+    <w:name w:val="FollowedHyperlink"/>
+    <w:basedOn w:val="DefaultParagraphFont"/>
+    <w:uiPriority w:val="99"/>
+    <w:semiHidden/>
+    <w:unhideWhenUsed/>
+    <w:rsid w:val="00607532"/>
+    <w:rPr>
+      <w:color w:val="954F72" w:themeColor="followedHyperlink"/>
+      <w:u w:val="single"/>
+    </w:rPr>
   </w:style>
 </w:styles>
 </file>

</xml_diff>